<commit_message>
new test for 2 switch
</commit_message>
<xml_diff>
--- a/0_Instruction.docx
+++ b/0_Instruction.docx
@@ -4730,6 +4730,9 @@
     </w:tbl>
     <w:p>
       <w:r>
+        <w:rPr>
+          <w:noProof/>
+        </w:rPr>
         <w:drawing>
           <wp:anchor distT="0" distB="0" distL="114300" distR="114300" simplePos="0" relativeHeight="251659264" behindDoc="1" locked="0" layoutInCell="1" allowOverlap="1" wp14:anchorId="2054A5E4" wp14:editId="3D941D5F">
             <wp:simplePos x="0" y="0"/>
@@ -4811,10 +4814,7 @@
     </w:p>
     <w:p>
       <w:r>
-        <w:t xml:space="preserve">1. </w:t>
-      </w:r>
-      <w:r>
-        <w:t>Выбор интерфейса подключения (доступен только</w:t>
+        <w:t>1. Выбор интерфейса подключения (доступен только</w:t>
       </w:r>
       <w:r>
         <w:t xml:space="preserve"> </w:t>
@@ -4833,16 +4833,7 @@
     </w:p>
     <w:p>
       <w:r>
-        <w:t xml:space="preserve">2. </w:t>
-      </w:r>
-      <w:r>
-        <w:t>Добавление файл</w:t>
-      </w:r>
-      <w:r>
-        <w:t>а</w:t>
-      </w:r>
-      <w:r>
-        <w:t xml:space="preserve"> адресного пространства в формате </w:t>
+        <w:t xml:space="preserve">2. Добавление файла адресного пространства в формате </w:t>
       </w:r>
       <w:r>
         <w:t>*.</w:t>
@@ -4856,10 +4847,7 @@
     </w:p>
     <w:p>
       <w:r>
-        <w:t>3</w:t>
-      </w:r>
-      <w:r>
-        <w:t>.</w:t>
+        <w:t>3.</w:t>
       </w:r>
       <w:r>
         <w:t xml:space="preserve"> </w:t>
@@ -4899,25 +4887,7 @@
         <w:rPr>
           <w:color w:val="FF0000"/>
         </w:rPr>
-        <w:t>Работа с</w:t>
-      </w:r>
-      <w:r>
-        <w:rPr>
-          <w:color w:val="FF0000"/>
-        </w:rPr>
-        <w:t xml:space="preserve"> устройств</w:t>
-      </w:r>
-      <w:r>
-        <w:rPr>
-          <w:color w:val="FF0000"/>
-        </w:rPr>
-        <w:t>ом</w:t>
-      </w:r>
-      <w:r>
-        <w:rPr>
-          <w:color w:val="FF0000"/>
-        </w:rPr>
-        <w:t xml:space="preserve"> в приложении</w:t>
+        <w:t>Работа с устройством в приложении</w:t>
       </w:r>
     </w:p>
     <w:p>
@@ -5237,6 +5207,9 @@
     <w:p/>
     <w:p>
       <w:r>
+        <w:rPr>
+          <w:noProof/>
+        </w:rPr>
         <w:drawing>
           <wp:inline distT="0" distB="0" distL="0" distR="0" wp14:anchorId="5C942DC8" wp14:editId="3BAD487E">
             <wp:extent cx="3048000" cy="3238500"/>
@@ -5356,13 +5329,7 @@
         <w:t>переменную)</w:t>
       </w:r>
     </w:p>
-    <w:p>
-      <w:pPr>
-        <w:rPr>
-          <w:lang w:val="en-US"/>
-        </w:rPr>
-      </w:pPr>
-    </w:p>
+    <w:p/>
     <w:p>
       <w:r>
         <w:t xml:space="preserve">Если было выполнено чтение, то доступно еще </w:t>
@@ -5404,6 +5371,9 @@
     <w:p/>
     <w:p>
       <w:r>
+        <w:rPr>
+          <w:noProof/>
+        </w:rPr>
         <w:drawing>
           <wp:inline distT="0" distB="0" distL="0" distR="0" wp14:anchorId="4F185050" wp14:editId="72CDEB8B">
             <wp:extent cx="5238750" cy="4857750"/>
@@ -6643,6 +6613,56 @@
       </w:r>
     </w:p>
     <w:p/>
+    <w:p/>
+    <w:p>
+      <w:pPr>
+        <w:rPr>
+          <w:color w:val="FF0000"/>
+        </w:rPr>
+      </w:pPr>
+      <w:proofErr w:type="spellStart"/>
+      <w:r>
+        <w:rPr>
+          <w:color w:val="FF0000"/>
+        </w:rPr>
+        <w:t>Instrument</w:t>
+      </w:r>
+      <w:proofErr w:type="spellEnd"/>
+      <w:r>
+        <w:rPr>
+          <w:color w:val="FF0000"/>
+        </w:rPr>
+        <w:t xml:space="preserve"> </w:t>
+      </w:r>
+      <w:proofErr w:type="spellStart"/>
+      <w:r>
+        <w:rPr>
+          <w:color w:val="FF0000"/>
+        </w:rPr>
+        <w:t>Control</w:t>
+      </w:r>
+      <w:proofErr w:type="spellEnd"/>
+      <w:r>
+        <w:rPr>
+          <w:color w:val="FF0000"/>
+        </w:rPr>
+        <w:t xml:space="preserve"> </w:t>
+      </w:r>
+      <w:proofErr w:type="spellStart"/>
+      <w:r>
+        <w:rPr>
+          <w:color w:val="FF0000"/>
+        </w:rPr>
+        <w:t>Toolbox</w:t>
+      </w:r>
+      <w:proofErr w:type="spellEnd"/>
+      <w:r>
+        <w:rPr>
+          <w:color w:val="FF0000"/>
+        </w:rPr>
+        <w:t>???</w:t>
+      </w:r>
+    </w:p>
     <w:sectPr>
       <w:pgSz w:w="11906" w:h="16838"/>
       <w:pgMar w:top="1440" w:right="1080" w:bottom="1440" w:left="1080" w:header="708" w:footer="708" w:gutter="0"/>

</xml_diff>